<commit_message>
fix: updated PDF report about virtualization.
</commit_message>
<xml_diff>
--- a/Assets/doc/RAPPORT SAE 1.03 INTRO.docx
+++ b/Assets/doc/RAPPORT SAE 1.03 INTRO.docx
@@ -275,6 +275,7 @@
         </w:numPr>
       </w:pPr>
       <w:r>
+        <w:lastRenderedPageBreak/>
         <w:t xml:space="preserve"> </w:t>
       </w:r>
       <w:r>
@@ -321,10 +322,7 @@
     <w:p>
       <w:pPr>
         <w:pStyle w:val="Heading1"/>
-        <w:numPr>
-          <w:ilvl w:val="0"/>
-          <w:numId w:val="2"/>
-        </w:numPr>
+        <w:ind w:left="708"/>
         <w:rPr>
           <w:sz w:val="44"/>
           <w:szCs w:val="44"/>
@@ -880,6 +878,7 @@
         <w:pStyle w:val="Heading1"/>
       </w:pPr>
       <w:r>
+        <w:lastRenderedPageBreak/>
         <w:t>III La création de la machine virtuelle :</w:t>
       </w:r>
     </w:p>
@@ -1048,7 +1047,11 @@
         <w:t>e d’abord un type 1 qui permet de virtualiser</w:t>
       </w:r>
       <w:r>
-        <w:t xml:space="preserve"> directement sur une interface sans passer par un programme. Alors que les hyperviseurs de type 2 passent par des logiciels informatiques comme VirtualBox ou VMWare, et </w:t>
+        <w:t xml:space="preserve"> directement sur une interface sans passer par un programme. Alors que les hyperviseurs de type 2 passent par des logiciels informatiques comme VirtualBox ou </w:t>
+      </w:r>
+      <w:r>
+        <w:lastRenderedPageBreak/>
+        <w:t xml:space="preserve">VMWare, et </w:t>
       </w:r>
       <w:r>
         <w:t xml:space="preserve">réalisent une « copie » conforme </w:t>
@@ -1282,7 +1285,11 @@
         <w:t> »</w:t>
       </w:r>
       <w:r>
-        <w:t xml:space="preserve"> ainsi que git afin de pouvoir télécharger notre « repository » GitHub</w:t>
+        <w:t xml:space="preserve"> ainsi que git afin de pouvoir télécharger </w:t>
+      </w:r>
+      <w:r>
+        <w:lastRenderedPageBreak/>
+        <w:t>notre « repository » GitHub</w:t>
       </w:r>
       <w:r>
         <w:t xml:space="preserve"> et de le déployer.</w:t>
@@ -1504,6 +1511,7 @@
         <w:pStyle w:val="ListParagraph"/>
       </w:pPr>
       <w:r>
+        <w:lastRenderedPageBreak/>
         <w:drawing>
           <wp:inline distT="0" distB="0" distL="0" distR="0" wp14:anchorId="44046E8B" wp14:editId="6AD82213">
             <wp:extent cx="3466367" cy="2392680"/>
@@ -3487,7 +3495,7 @@
     <w:qFormat/>
   </w:style>
   <w:style w:type="paragraph" w:styleId="Heading1">
-    <w:name w:val="heading 1"/>
+    <w:name w:val="Heading 1"/>
     <w:basedOn w:val="Normal"/>
     <w:next w:val="Normal"/>
     <w:uiPriority w:val="9"/>
@@ -3507,7 +3515,7 @@
     </w:rPr>
   </w:style>
   <w:style w:type="paragraph" w:styleId="Heading2">
-    <w:name w:val="heading 2"/>
+    <w:name w:val="Heading 2"/>
     <w:basedOn w:val="Normal"/>
     <w:next w:val="Normal"/>
     <w:uiPriority w:val="9"/>
@@ -3529,7 +3537,7 @@
     </w:rPr>
   </w:style>
   <w:style w:type="paragraph" w:styleId="Heading3">
-    <w:name w:val="heading 3"/>
+    <w:name w:val="Heading 3"/>
     <w:basedOn w:val="Normal"/>
     <w:next w:val="Normal"/>
     <w:uiPriority w:val="9"/>
@@ -3551,7 +3559,7 @@
     </w:rPr>
   </w:style>
   <w:style w:type="paragraph" w:styleId="Heading4">
-    <w:name w:val="heading 4"/>
+    <w:name w:val="Heading 4"/>
     <w:basedOn w:val="Normal"/>
     <w:next w:val="Normal"/>
     <w:uiPriority w:val="9"/>
@@ -3573,7 +3581,7 @@
     </w:rPr>
   </w:style>
   <w:style w:type="paragraph" w:styleId="Heading5">
-    <w:name w:val="heading 5"/>
+    <w:name w:val="Heading 5"/>
     <w:basedOn w:val="Normal"/>
     <w:next w:val="Normal"/>
     <w:uiPriority w:val="9"/>
@@ -3593,7 +3601,7 @@
     </w:rPr>
   </w:style>
   <w:style w:type="paragraph" w:styleId="Heading6">
-    <w:name w:val="heading 6"/>
+    <w:name w:val="Heading 6"/>
     <w:basedOn w:val="Normal"/>
     <w:next w:val="Normal"/>
     <w:uiPriority w:val="9"/>
@@ -3615,7 +3623,7 @@
     </w:rPr>
   </w:style>
   <w:style w:type="paragraph" w:styleId="Heading7">
-    <w:name w:val="heading 7"/>
+    <w:name w:val="Heading 7"/>
     <w:basedOn w:val="Normal"/>
     <w:next w:val="Normal"/>
     <w:uiPriority w:val="9"/>
@@ -3635,7 +3643,7 @@
     </w:rPr>
   </w:style>
   <w:style w:type="paragraph" w:styleId="Heading8">
-    <w:name w:val="heading 8"/>
+    <w:name w:val="Heading 8"/>
     <w:basedOn w:val="Normal"/>
     <w:next w:val="Normal"/>
     <w:uiPriority w:val="9"/>
@@ -3657,7 +3665,7 @@
     </w:rPr>
   </w:style>
   <w:style w:type="paragraph" w:styleId="Heading9">
-    <w:name w:val="heading 9"/>
+    <w:name w:val="Heading 9"/>
     <w:basedOn w:val="Normal"/>
     <w:next w:val="Normal"/>
     <w:uiPriority w:val="9"/>
@@ -3676,14 +3684,14 @@
       <w:color w:val="272727" w:themeColor="text1" w:themeTint="D8"/>
     </w:rPr>
   </w:style>
-  <w:style w:type="character" w:default="1" w:styleId="DefaultParagraphFont">
+  <w:style w:type="character" w:default="1" w:styleId="Policepardfaut">
     <w:name w:val="Default Paragraph Font"/>
     <w:uiPriority w:val="1"/>
     <w:semiHidden/>
     <w:unhideWhenUsed/>
   </w:style>
   <w:style w:type="table" w:default="1" w:styleId="TableNormal">
-    <w:name w:val="Normal Table"/>
+    <w:name w:val="Table Normal"/>
     <w:uiPriority w:val="99"/>
     <w:semiHidden/>
     <w:unhideWhenUsed/>
@@ -3705,7 +3713,7 @@
   </w:style>
   <w:style w:type="character" w:customStyle="1" w:styleId="Sous-titreCar2">
     <w:name w:val="Sous-titre Car2"/>
-    <w:basedOn w:val="DefaultParagraphFont"/>
+    <w:basedOn w:val="Policepardfaut"/>
     <w:uiPriority w:val="11"/>
     <w:rsid w:val="001F4F2C"/>
     <w:rPr>
@@ -3729,7 +3737,7 @@
   </w:style>
   <w:style w:type="character" w:styleId="IntenseEmphasis">
     <w:name w:val="Intense Emphasis"/>
-    <w:basedOn w:val="DefaultParagraphFont"/>
+    <w:basedOn w:val="Policepardfaut"/>
     <w:uiPriority w:val="21"/>
     <w:qFormat/>
     <w:rsid w:val="00F84E24"/>
@@ -3741,7 +3749,7 @@
   </w:style>
   <w:style w:type="character" w:styleId="IntenseReference">
     <w:name w:val="Intense Reference"/>
-    <w:basedOn w:val="DefaultParagraphFont"/>
+    <w:basedOn w:val="Policepardfaut"/>
     <w:uiPriority w:val="32"/>
     <w:qFormat/>
     <w:rsid w:val="00F84E24"/>
@@ -3753,10 +3761,10 @@
       <w:spacing w:val="5"/>
     </w:rPr>
   </w:style>
-  <w:style w:type="paragraph" w:styleId="HTMLPreformatted">
+  <w:style w:type="paragraph" w:styleId="PrformatHTML">
     <w:name w:val="HTML Preformatted"/>
     <w:basedOn w:val="Normal"/>
-    <w:link w:val="HTMLPreformattedChar"/>
+    <w:link w:val="PrformatHTMLCar"/>
     <w:uiPriority w:val="99"/>
     <w:semiHidden/>
     <w:unhideWhenUsed/>
@@ -3770,10 +3778,10 @@
       <w:szCs w:val="20"/>
     </w:rPr>
   </w:style>
-  <w:style w:type="character" w:customStyle="1" w:styleId="HTMLPreformattedChar">
-    <w:name w:val="HTML Preformatted Char"/>
-    <w:basedOn w:val="DefaultParagraphFont"/>
-    <w:link w:val="HTMLPreformatted"/>
+  <w:style w:type="character" w:customStyle="1" w:styleId="PrformatHTMLCar">
+    <w:name w:val="Préformaté HTML Car"/>
+    <w:basedOn w:val="Policepardfaut"/>
+    <w:link w:val="PrformatHTML"/>
     <w:uiPriority w:val="99"/>
     <w:semiHidden/>
     <w:rsid w:val="004A238A"/>
@@ -3785,7 +3793,7 @@
   </w:style>
   <w:style w:type="character" w:customStyle="1" w:styleId="TitreCar">
     <w:name w:val="Titre Car"/>
-    <w:basedOn w:val="DefaultParagraphFont"/>
+    <w:basedOn w:val="Policepardfaut"/>
     <w:uiPriority w:val="10"/>
     <w:rsid w:val="00E53563"/>
     <w:rPr>
@@ -3798,7 +3806,7 @@
   </w:style>
   <w:style w:type="character" w:customStyle="1" w:styleId="Sous-titreCar">
     <w:name w:val="Sous-titre Car"/>
-    <w:basedOn w:val="DefaultParagraphFont"/>
+    <w:basedOn w:val="Policepardfaut"/>
     <w:uiPriority w:val="11"/>
     <w:rsid w:val="00E53563"/>
     <w:rPr>
@@ -3811,7 +3819,7 @@
   </w:style>
   <w:style w:type="character" w:customStyle="1" w:styleId="Titre1Car">
     <w:name w:val="Titre 1 Car"/>
-    <w:basedOn w:val="DefaultParagraphFont"/>
+    <w:basedOn w:val="Policepardfaut"/>
     <w:uiPriority w:val="9"/>
     <w:rsid w:val="00E53563"/>
     <w:rPr>
@@ -3823,7 +3831,7 @@
   </w:style>
   <w:style w:type="character" w:customStyle="1" w:styleId="Titre2Car">
     <w:name w:val="Titre 2 Car"/>
-    <w:basedOn w:val="DefaultParagraphFont"/>
+    <w:basedOn w:val="Policepardfaut"/>
     <w:uiPriority w:val="9"/>
     <w:semiHidden/>
     <w:rsid w:val="00E53563"/>
@@ -3836,7 +3844,7 @@
   </w:style>
   <w:style w:type="character" w:customStyle="1" w:styleId="Titre3Car">
     <w:name w:val="Titre 3 Car"/>
-    <w:basedOn w:val="DefaultParagraphFont"/>
+    <w:basedOn w:val="Policepardfaut"/>
     <w:uiPriority w:val="9"/>
     <w:semiHidden/>
     <w:rsid w:val="00E53563"/>
@@ -3849,7 +3857,7 @@
   </w:style>
   <w:style w:type="character" w:customStyle="1" w:styleId="Titre4Car">
     <w:name w:val="Titre 4 Car"/>
-    <w:basedOn w:val="DefaultParagraphFont"/>
+    <w:basedOn w:val="Policepardfaut"/>
     <w:uiPriority w:val="9"/>
     <w:semiHidden/>
     <w:rsid w:val="00E53563"/>
@@ -3862,7 +3870,7 @@
   </w:style>
   <w:style w:type="character" w:customStyle="1" w:styleId="Titre5Car">
     <w:name w:val="Titre 5 Car"/>
-    <w:basedOn w:val="DefaultParagraphFont"/>
+    <w:basedOn w:val="Policepardfaut"/>
     <w:uiPriority w:val="9"/>
     <w:semiHidden/>
     <w:rsid w:val="00E53563"/>
@@ -3873,7 +3881,7 @@
   </w:style>
   <w:style w:type="character" w:customStyle="1" w:styleId="Titre6Car">
     <w:name w:val="Titre 6 Car"/>
-    <w:basedOn w:val="DefaultParagraphFont"/>
+    <w:basedOn w:val="Policepardfaut"/>
     <w:uiPriority w:val="9"/>
     <w:semiHidden/>
     <w:rsid w:val="00E53563"/>
@@ -3886,7 +3894,7 @@
   </w:style>
   <w:style w:type="character" w:customStyle="1" w:styleId="Titre7Car">
     <w:name w:val="Titre 7 Car"/>
-    <w:basedOn w:val="DefaultParagraphFont"/>
+    <w:basedOn w:val="Policepardfaut"/>
     <w:uiPriority w:val="9"/>
     <w:semiHidden/>
     <w:rsid w:val="00E53563"/>
@@ -3897,7 +3905,7 @@
   </w:style>
   <w:style w:type="character" w:customStyle="1" w:styleId="Titre8Car">
     <w:name w:val="Titre 8 Car"/>
-    <w:basedOn w:val="DefaultParagraphFont"/>
+    <w:basedOn w:val="Policepardfaut"/>
     <w:uiPriority w:val="9"/>
     <w:semiHidden/>
     <w:rsid w:val="00E53563"/>
@@ -3910,7 +3918,7 @@
   </w:style>
   <w:style w:type="character" w:customStyle="1" w:styleId="Titre9Car">
     <w:name w:val="Titre 9 Car"/>
-    <w:basedOn w:val="DefaultParagraphFont"/>
+    <w:basedOn w:val="Policepardfaut"/>
     <w:uiPriority w:val="9"/>
     <w:semiHidden/>
     <w:rsid w:val="00E53563"/>
@@ -3921,7 +3929,7 @@
   </w:style>
   <w:style w:type="character" w:customStyle="1" w:styleId="CitationCar">
     <w:name w:val="Citation Car"/>
-    <w:basedOn w:val="DefaultParagraphFont"/>
+    <w:basedOn w:val="Policepardfaut"/>
     <w:uiPriority w:val="29"/>
     <w:rsid w:val="00E53563"/>
     <w:rPr>
@@ -3932,7 +3940,7 @@
   </w:style>
   <w:style w:type="character" w:customStyle="1" w:styleId="CitationintenseCar">
     <w:name w:val="Citation intense Car"/>
-    <w:basedOn w:val="DefaultParagraphFont"/>
+    <w:basedOn w:val="Policepardfaut"/>
     <w:uiPriority w:val="30"/>
     <w:rsid w:val="00E53563"/>
     <w:rPr>

</xml_diff>